<commit_message>
Externaliza estilos a CSS y agrega pausa del carrusel por foco de teclado
</commit_message>
<xml_diff>
--- a/docs/Fernando_Fuentes_PFY2201_EXP2_S5_.docx
+++ b/docs/Fernando_Fuentes_PFY2201_EXP2_S5_.docx
@@ -146,7 +146,7 @@
               </wp:anchor>
             </w:drawing>
           </mc:Choice>
-          <mc:Fallback xmlns:a14="http://schemas.microsoft.com/office/drawing/2010/main" xmlns:pic="http://schemas.openxmlformats.org/drawingml/2006/picture" xmlns:adec="http://schemas.microsoft.com/office/drawing/2017/decorative" xmlns:a="http://schemas.openxmlformats.org/drawingml/2006/main" xmlns:w16cei="http://schemas.microsoft.com/office/word/2026/wordml/cei">
+          <mc:Fallback xmlns:w16cei="http://schemas.microsoft.com/office/word/2026/wordml/cei" xmlns:a="http://schemas.openxmlformats.org/drawingml/2006/main" xmlns:adec="http://schemas.microsoft.com/office/drawing/2017/decorative" xmlns:pic="http://schemas.openxmlformats.org/drawingml/2006/picture" xmlns:a14="http://schemas.microsoft.com/office/drawing/2010/main">
             <w:pict xmlns:w="http://schemas.openxmlformats.org/wordprocessingml/2006/main">
               <v:roundrect xmlns:w14="http://schemas.microsoft.com/office/word/2010/wordml" xmlns:o="urn:schemas-microsoft-com:office:office" xmlns:v="urn:schemas-microsoft-com:vml" id="Rectángulo: esquinas redondeadas 1" style="position:absolute;margin-left:151.8pt;margin-top:-54.75pt;width:376.95pt;height:20.7pt;z-index:251668479;visibility:visible;mso-wrap-style:square;mso-wrap-distance-left:9pt;mso-wrap-distance-top:0;mso-wrap-distance-right:9pt;mso-wrap-distance-bottom:0;mso-position-horizontal:absolute;mso-position-horizontal-relative:text;mso-position-vertical:absolute;mso-position-vertical-relative:text;v-text-anchor:middle" alt="&quot;&quot;" o:spid="_x0000_s1026" fillcolor="#e7e8e9" stroked="f" strokeweight="1pt" arcsize=".5" w14:anchorId="07EEE52D" o:gfxdata="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">
                 <v:stroke joinstyle="miter"/>
@@ -221,7 +221,7 @@
               </wp:anchor>
             </w:drawing>
           </mc:Choice>
-          <mc:Fallback xmlns:a14="http://schemas.microsoft.com/office/drawing/2010/main" xmlns:pic="http://schemas.openxmlformats.org/drawingml/2006/picture" xmlns:adec="http://schemas.microsoft.com/office/drawing/2017/decorative" xmlns:a="http://schemas.openxmlformats.org/drawingml/2006/main" xmlns:w16cei="http://schemas.microsoft.com/office/word/2026/wordml/cei">
+          <mc:Fallback xmlns:w16cei="http://schemas.microsoft.com/office/word/2026/wordml/cei" xmlns:a="http://schemas.openxmlformats.org/drawingml/2006/main" xmlns:adec="http://schemas.microsoft.com/office/drawing/2017/decorative" xmlns:pic="http://schemas.openxmlformats.org/drawingml/2006/picture" xmlns:a14="http://schemas.microsoft.com/office/drawing/2010/main">
             <w:pict>
               <v:roundrect id="AutoShape 14" style="position:absolute;margin-left:-25.6pt;margin-top:-17.6pt;width:554.7pt;height:303pt;z-index:251671552;visibility:visible;mso-wrap-style:square;mso-wrap-distance-left:9pt;mso-wrap-distance-top:0;mso-wrap-distance-right:9pt;mso-wrap-distance-bottom:0;mso-position-horizontal:absolute;mso-position-horizontal-relative:text;mso-position-vertical:absolute;mso-position-vertical-relative:text;v-text-anchor:top" alt="&quot;&quot;" o:spid="_x0000_s1026" stroked="f" arcsize="2907f" w14:anchorId="3DBDE4CA" o:gfxdata="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">
                 <v:fill type="frame" o:title="" recolor="t" rotate="t" r:id="rId13"/>
@@ -346,7 +346,7 @@
               </wp:anchor>
             </w:drawing>
           </mc:Choice>
-          <mc:Fallback xmlns:adec="http://schemas.microsoft.com/office/drawing/2017/decorative" xmlns:a14="http://schemas.microsoft.com/office/drawing/2010/main" xmlns:pic="http://schemas.openxmlformats.org/drawingml/2006/picture" xmlns:a="http://schemas.openxmlformats.org/drawingml/2006/main" xmlns:w16cei="http://schemas.microsoft.com/office/word/2026/wordml/cei">
+          <mc:Fallback xmlns:w16cei="http://schemas.microsoft.com/office/word/2026/wordml/cei" xmlns:a="http://schemas.openxmlformats.org/drawingml/2006/main" xmlns:pic="http://schemas.openxmlformats.org/drawingml/2006/picture" xmlns:a14="http://schemas.microsoft.com/office/drawing/2010/main" xmlns:adec="http://schemas.microsoft.com/office/drawing/2017/decorative">
             <w:pict>
               <v:roundrect id="Rectángulo: esquinas redondeadas 6" style="position:absolute;margin-left:-24.85pt;margin-top:35.55pt;width:8.55pt;height:56.7pt;z-index:251673600;visibility:visible;mso-wrap-style:square;mso-width-percent:0;mso-height-percent:0;mso-wrap-distance-left:9pt;mso-wrap-distance-top:0;mso-wrap-distance-right:9pt;mso-wrap-distance-bottom:0;mso-position-horizontal:absolute;mso-position-horizontal-relative:text;mso-position-vertical:absolute;mso-position-vertical-relative:text;mso-width-percent:0;mso-height-percent:0;mso-width-relative:margin;mso-height-relative:margin;v-text-anchor:middle" alt="&quot;&quot;" o:spid="_x0000_s1026" fillcolor="#ffb800" stroked="f" strokeweight="1pt" arcsize="0" w14:anchorId="19FE2BFE" o:gfxdata="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">
                 <v:stroke joinstyle="miter"/>
@@ -1029,10 +1029,7 @@
       </w:pPr>
       <w:r>
         <w:lastRenderedPageBreak/>
-        <w:t>5</w:t>
-      </w:r>
-      <w:r>
-        <w:t>. Fetch API: catálogo externo cargado correctamente</w:t>
+        <w:t>5. Fetch API: catálogo externo cargado correctamente</w:t>
       </w:r>
     </w:p>
     <w:p>
@@ -1117,10 +1114,7 @@
       </w:pPr>
       <w:r>
         <w:lastRenderedPageBreak/>
-        <w:t>6</w:t>
-      </w:r>
-      <w:r>
-        <w:t>. Fetch API: manejo de errores con opción de reintentar</w:t>
+        <w:t>6. Fetch API: manejo de errores con opción de reintentar</w:t>
       </w:r>
     </w:p>
     <w:p>
@@ -1208,10 +1202,7 @@
       </w:pPr>
       <w:r>
         <w:lastRenderedPageBreak/>
-        <w:t>7</w:t>
-      </w:r>
-      <w:r>
-        <w:t>. Fetch API: recuperación exitosa tras reintentar</w:t>
+        <w:t>7. Fetch API: recuperación exitosa tras reintentar</w:t>
       </w:r>
     </w:p>
     <w:p>
@@ -1296,10 +1287,7 @@
       </w:pPr>
       <w:r>
         <w:lastRenderedPageBreak/>
-        <w:t>8</w:t>
-      </w:r>
-      <w:r>
-        <w:t>. Evento submit: validación de formulario</w:t>
+        <w:t>8. Evento submit: validación de formulario</w:t>
       </w:r>
     </w:p>
     <w:p>
@@ -1384,10 +1372,7 @@
       </w:pPr>
       <w:r>
         <w:lastRenderedPageBreak/>
-        <w:t>9</w:t>
-      </w:r>
-      <w:r>
-        <w:t>. Evento submit: envío exitoso</w:t>
+        <w:t>9. Evento submit: envío exitoso</w:t>
       </w:r>
     </w:p>
     <w:p>
@@ -1458,10 +1443,7 @@
       </w:pPr>
       <w:r>
         <w:lastRenderedPageBreak/>
-        <w:t>10</w:t>
-      </w:r>
-      <w:r>
-        <w:t>. Vista de tablet (768 px)</w:t>
+        <w:t>10. Vista de tablet (768 px)</w:t>
       </w:r>
     </w:p>
     <w:p>
@@ -1535,13 +1517,7 @@
       </w:pPr>
       <w:r>
         <w:lastRenderedPageBreak/>
-        <w:t>1</w:t>
-      </w:r>
-      <w:r>
-        <w:t>1</w:t>
-      </w:r>
-      <w:r>
-        <w:t>. Vista móvil (375 px)</w:t>
+        <w:t>11. Vista móvil (375 px)</w:t>
       </w:r>
     </w:p>
     <w:p>
@@ -1620,13 +1596,7 @@
       </w:pPr>
       <w:r>
         <w:lastRenderedPageBreak/>
-        <w:t>1</w:t>
-      </w:r>
-      <w:r>
-        <w:t>2</w:t>
-      </w:r>
-      <w:r>
-        <w:t>. Menú de navegación móvil desplegado</w:t>
+        <w:t>12. Menú de navegación móvil desplegado</w:t>
       </w:r>
     </w:p>
     <w:p>
@@ -1737,6 +1707,22 @@
         <w:spacing w:line="240" w:lineRule="auto"/>
       </w:pPr>
       <w:r>
+        <w:t>├── css/</w:t>
+      </w:r>
+    </w:p>
+    <w:p>
+      <w:pPr>
+        <w:spacing w:line="240" w:lineRule="auto"/>
+      </w:pPr>
+      <w:r>
+        <w:t>│   └── FernandoFuentes_PFY2201_DOM_Semana5.css</w:t>
+      </w:r>
+    </w:p>
+    <w:p>
+      <w:pPr>
+        <w:spacing w:line="240" w:lineRule="auto"/>
+      </w:pPr>
+      <w:r>
         <w:t>├── js/</w:t>
       </w:r>
     </w:p>
@@ -1797,13 +1783,7 @@
         <w:spacing w:line="240" w:lineRule="auto"/>
       </w:pPr>
       <w:r>
-        <w:t xml:space="preserve">    └── FernandoFuentes_PFY2201_</w:t>
-      </w:r>
-      <w:r>
-        <w:t>EXP2_S5</w:t>
-      </w:r>
-      <w:r>
-        <w:t>.docx</w:t>
+        <w:t xml:space="preserve">    └── FernandoFuentes_PFY2201_Capturas_Semana5.docx</w:t>
       </w:r>
     </w:p>
     <w:p>
@@ -1908,7 +1888,7 @@
               </wp:anchor>
             </w:drawing>
           </mc:Choice>
-          <mc:Fallback xmlns:adec="http://schemas.microsoft.com/office/drawing/2017/decorative" xmlns:a14="http://schemas.microsoft.com/office/drawing/2010/main" xmlns:pic="http://schemas.openxmlformats.org/drawingml/2006/picture" xmlns:a="http://schemas.openxmlformats.org/drawingml/2006/main" xmlns:w16cei="http://schemas.microsoft.com/office/word/2026/wordml/cei">
+          <mc:Fallback xmlns:w16cei="http://schemas.microsoft.com/office/word/2026/wordml/cei" xmlns:a="http://schemas.openxmlformats.org/drawingml/2006/main" xmlns:pic="http://schemas.openxmlformats.org/drawingml/2006/picture" xmlns:a14="http://schemas.microsoft.com/office/drawing/2010/main" xmlns:adec="http://schemas.microsoft.com/office/drawing/2017/decorative">
             <w:pict>
               <v:roundrect id="Rectángulo: esquinas redondeadas 1" style="position:absolute;margin-left:-29.55pt;margin-top:31.55pt;width:552.75pt;height:354.35pt;z-index:251676672;visibility:visible;mso-wrap-style:square;mso-wrap-distance-left:9pt;mso-wrap-distance-top:0;mso-wrap-distance-right:9pt;mso-wrap-distance-bottom:0;mso-position-horizontal:absolute;mso-position-horizontal-relative:text;mso-position-vertical:absolute;mso-position-vertical-relative:text;v-text-anchor:middle" alt="&quot;&quot;" o:spid="_x0000_s1026" fillcolor="#e6e7e8" stroked="f" strokeweight="1pt" arcsize="2030f" w14:anchorId="3F5385BB" o:gfxdata="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">
                 <v:stroke joinstyle="miter"/>
@@ -1928,7 +1908,7 @@
           <w:noProof/>
         </w:rPr>
         <w:drawing>
-          <wp:anchor distT="0" distB="0" distL="114300" distR="114300" simplePos="0" relativeHeight="251677696" behindDoc="0" locked="0" layoutInCell="1" allowOverlap="1" wp14:anchorId="2A005252" wp14:editId="77FDD91A">
+          <wp:anchor distT="0" distB="0" distL="114300" distR="114300" simplePos="0" relativeHeight="251677696" behindDoc="0" locked="0" layoutInCell="1" allowOverlap="1" wp14:anchorId="2A005252" wp14:editId="7B477919">
             <wp:simplePos x="0" y="0"/>
             <wp:positionH relativeFrom="column">
               <wp:posOffset>1642954</wp:posOffset>
@@ -2215,7 +2195,7 @@
                 </wp:anchor>
               </w:drawing>
             </mc:Choice>
-            <mc:Fallback xmlns:a14="http://schemas.microsoft.com/office/drawing/2010/main" xmlns:pic="http://schemas.openxmlformats.org/drawingml/2006/picture" xmlns:adec="http://schemas.microsoft.com/office/drawing/2017/decorative" xmlns:a="http://schemas.openxmlformats.org/drawingml/2006/main" xmlns:w16cei="http://schemas.microsoft.com/office/word/2026/wordml/cei">
+            <mc:Fallback xmlns:w16cei="http://schemas.microsoft.com/office/word/2026/wordml/cei" xmlns:a="http://schemas.openxmlformats.org/drawingml/2006/main" xmlns:adec="http://schemas.microsoft.com/office/drawing/2017/decorative" xmlns:pic="http://schemas.openxmlformats.org/drawingml/2006/picture" xmlns:a14="http://schemas.microsoft.com/office/drawing/2010/main">
               <w:pict>
                 <v:group id="Grupo 1" style="position:absolute;margin-left:409.95pt;margin-top:-3.8pt;width:94.15pt;height:22.7pt;z-index:251694080" alt="&quot;&quot;" coordsize="11957,2882" o:spid="_x0000_s1026" w14:anchorId="6CCFE1D3" o:gfxdata="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">
                   <v:shapetype id="_x0000_t75" coordsize="21600,21600" filled="f" stroked="f" o:spt="75" o:preferrelative="t" path="m@4@5l@4@11@9@11@9@5xe">
@@ -5230,6 +5210,10 @@
 </file>
 
 <file path=customXml/item1.xml><?xml version="1.0" encoding="utf-8"?>
+<b:Sources xmlns:b="http://schemas.openxmlformats.org/officeDocument/2006/bibliography" xmlns="http://schemas.openxmlformats.org/officeDocument/2006/bibliography" SelectedStyle="\APASixthEditionOfficeOnline.xsl" StyleName="APA" Version="6"/>
+</file>
+
+<file path=customXml/item2.xml><?xml version="1.0" encoding="utf-8"?>
 <p:properties xmlns:p="http://schemas.microsoft.com/office/2006/metadata/properties" xmlns:xsi="http://www.w3.org/2001/XMLSchema-instance" xmlns:pc="http://schemas.microsoft.com/office/infopath/2007/PartnerControls">
   <documentManagement>
     <lcf76f155ced4ddcb4097134ff3c332f xmlns="d0daa353-f819-43d1-badf-ce69fea8800d">
@@ -5250,20 +5234,7 @@
 </p:properties>
 </file>
 
-<file path=customXml/item2.xml><?xml version="1.0" encoding="utf-8"?>
-<b:Sources xmlns:b="http://schemas.openxmlformats.org/officeDocument/2006/bibliography" xmlns="http://schemas.openxmlformats.org/officeDocument/2006/bibliography" SelectedStyle="\APASixthEditionOfficeOnline.xsl" StyleName="APA" Version="6"/>
-</file>
-
 <file path=customXml/item3.xml><?xml version="1.0" encoding="utf-8"?>
-<?mso-contentType ?>
-<FormTemplates xmlns="http://schemas.microsoft.com/sharepoint/v3/contenttype/forms">
-  <Display>DocumentLibraryForm</Display>
-  <Edit>DocumentLibraryForm</Edit>
-  <New>DocumentLibraryForm</New>
-</FormTemplates>
-</file>
-
-<file path=customXml/item4.xml><?xml version="1.0" encoding="utf-8"?>
 <ct:contentTypeSchema xmlns:ct="http://schemas.microsoft.com/office/2006/metadata/contentType" xmlns:ma="http://schemas.microsoft.com/office/2006/metadata/properties/metaAttributes" ct:_="" ma:_="" ma:contentTypeName="Documento" ma:contentTypeID="0x01010070BFDEA41A5D8B46AA5DA2E2389CBE4E" ma:contentTypeVersion="19" ma:contentTypeDescription="Crear nuevo documento." ma:contentTypeScope="" ma:versionID="8582924e0409c10a8a1fc1eca5dfbb2e">
   <xsd:schema xmlns:xsd="http://www.w3.org/2001/XMLSchema" xmlns:xs="http://www.w3.org/2001/XMLSchema" xmlns:p="http://schemas.microsoft.com/office/2006/metadata/properties" xmlns:ns2="d0daa353-f819-43d1-badf-ce69fea8800d" xmlns:ns3="edc1eb1c-f9b5-429a-a0ce-702847a0aa2d" targetNamespace="http://schemas.microsoft.com/office/2006/metadata/properties" ma:root="true" ma:fieldsID="e4d7d6d0f63e48ebe5e4a9f31787ab41" ns2:_="" ns3:_="">
     <xsd:import namespace="d0daa353-f819-43d1-badf-ce69fea8800d"/>
@@ -5524,7 +5495,24 @@
 </ct:contentTypeSchema>
 </file>
 
+<file path=customXml/item4.xml><?xml version="1.0" encoding="utf-8"?>
+<?mso-contentType ?>
+<FormTemplates xmlns="http://schemas.microsoft.com/sharepoint/v3/contenttype/forms">
+  <Display>DocumentLibraryForm</Display>
+  <Edit>DocumentLibraryForm</Edit>
+  <New>DocumentLibraryForm</New>
+</FormTemplates>
+</file>
+
 <file path=customXml/itemProps1.xml><?xml version="1.0" encoding="utf-8"?>
+<ds:datastoreItem xmlns:ds="http://schemas.openxmlformats.org/officeDocument/2006/customXml" ds:itemID="{DEB73F9D-F662-47F0-B1B4-CC4EDF51573A}">
+  <ds:schemaRefs>
+    <ds:schemaRef ds:uri="http://schemas.openxmlformats.org/officeDocument/2006/bibliography"/>
+  </ds:schemaRefs>
+</ds:datastoreItem>
+</file>
+
+<file path=customXml/itemProps2.xml><?xml version="1.0" encoding="utf-8"?>
 <ds:datastoreItem xmlns:ds="http://schemas.openxmlformats.org/officeDocument/2006/customXml" ds:itemID="{C39D5494-1847-4215-BB00-A838605872D2}">
   <ds:schemaRefs>
     <ds:schemaRef ds:uri="http://schemas.microsoft.com/office/2006/metadata/properties"/>
@@ -5535,23 +5523,7 @@
 </ds:datastoreItem>
 </file>
 
-<file path=customXml/itemProps2.xml><?xml version="1.0" encoding="utf-8"?>
-<ds:datastoreItem xmlns:ds="http://schemas.openxmlformats.org/officeDocument/2006/customXml" ds:itemID="{DEB73F9D-F662-47F0-B1B4-CC4EDF51573A}">
-  <ds:schemaRefs>
-    <ds:schemaRef ds:uri="http://schemas.openxmlformats.org/officeDocument/2006/bibliography"/>
-  </ds:schemaRefs>
-</ds:datastoreItem>
-</file>
-
 <file path=customXml/itemProps3.xml><?xml version="1.0" encoding="utf-8"?>
-<ds:datastoreItem xmlns:ds="http://schemas.openxmlformats.org/officeDocument/2006/customXml" ds:itemID="{58D8DE95-DF74-49C6-8885-90B115E8F94F}">
-  <ds:schemaRefs>
-    <ds:schemaRef ds:uri="http://schemas.microsoft.com/sharepoint/v3/contenttype/forms"/>
-  </ds:schemaRefs>
-</ds:datastoreItem>
-</file>
-
-<file path=customXml/itemProps4.xml><?xml version="1.0" encoding="utf-8"?>
 <ds:datastoreItem xmlns:ds="http://schemas.openxmlformats.org/officeDocument/2006/customXml" ds:itemID="{02B5315E-B9B2-4463-9CDC-BBF780F98845}">
   <ds:schemaRefs>
     <ds:schemaRef ds:uri="http://schemas.microsoft.com/office/2006/metadata/contentType"/>
@@ -5568,4 +5540,12 @@
     <ds:schemaRef ds:uri="http://schemas.microsoft.com/internal/obd"/>
   </ds:schemaRefs>
 </ds:datastoreItem>
+</file>
+
+<file path=customXml/itemProps4.xml><?xml version="1.0" encoding="utf-8"?>
+<ds:datastoreItem xmlns:ds="http://schemas.openxmlformats.org/officeDocument/2006/customXml" ds:itemID="{58D8DE95-DF74-49C6-8885-90B115E8F94F}">
+  <ds:schemaRefs>
+    <ds:schemaRef ds:uri="http://schemas.microsoft.com/sharepoint/v3/contenttype/forms"/>
+  </ds:schemaRefs>
+</ds:datastoreItem>
 </file>
</xml_diff>

<commit_message>
Incorporación evidencias en diferentes navegadores en docs
</commit_message>
<xml_diff>
--- a/docs/Fernando_Fuentes_PFY2201_EXP2_S5_.docx
+++ b/docs/Fernando_Fuentes_PFY2201_EXP2_S5_.docx
@@ -146,7 +146,7 @@
               </wp:anchor>
             </w:drawing>
           </mc:Choice>
-          <mc:Fallback xmlns:a14="http://schemas.microsoft.com/office/drawing/2010/main" xmlns:pic="http://schemas.openxmlformats.org/drawingml/2006/picture" xmlns:adec="http://schemas.microsoft.com/office/drawing/2017/decorative" xmlns:a="http://schemas.openxmlformats.org/drawingml/2006/main" xmlns:w16cei="http://schemas.microsoft.com/office/word/2026/wordml/cei">
+          <mc:Fallback xmlns:w16cei="http://schemas.microsoft.com/office/word/2026/wordml/cei" xmlns:a="http://schemas.openxmlformats.org/drawingml/2006/main" xmlns:adec="http://schemas.microsoft.com/office/drawing/2017/decorative" xmlns:pic="http://schemas.openxmlformats.org/drawingml/2006/picture" xmlns:a14="http://schemas.microsoft.com/office/drawing/2010/main">
             <w:pict xmlns:w="http://schemas.openxmlformats.org/wordprocessingml/2006/main">
               <v:roundrect xmlns:w14="http://schemas.microsoft.com/office/word/2010/wordml" xmlns:o="urn:schemas-microsoft-com:office:office" xmlns:v="urn:schemas-microsoft-com:vml" id="Rectángulo: esquinas redondeadas 1" style="position:absolute;margin-left:151.8pt;margin-top:-54.75pt;width:376.95pt;height:20.7pt;z-index:251668479;visibility:visible;mso-wrap-style:square;mso-wrap-distance-left:9pt;mso-wrap-distance-top:0;mso-wrap-distance-right:9pt;mso-wrap-distance-bottom:0;mso-position-horizontal:absolute;mso-position-horizontal-relative:text;mso-position-vertical:absolute;mso-position-vertical-relative:text;v-text-anchor:middle" alt="&quot;&quot;" o:spid="_x0000_s1026" fillcolor="#e7e8e9" stroked="f" strokeweight="1pt" arcsize=".5" w14:anchorId="07EEE52D" o:gfxdata="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">
                 <v:stroke joinstyle="miter"/>
@@ -221,7 +221,7 @@
               </wp:anchor>
             </w:drawing>
           </mc:Choice>
-          <mc:Fallback xmlns:a14="http://schemas.microsoft.com/office/drawing/2010/main" xmlns:pic="http://schemas.openxmlformats.org/drawingml/2006/picture" xmlns:adec="http://schemas.microsoft.com/office/drawing/2017/decorative" xmlns:a="http://schemas.openxmlformats.org/drawingml/2006/main" xmlns:w16cei="http://schemas.microsoft.com/office/word/2026/wordml/cei">
+          <mc:Fallback xmlns:w16cei="http://schemas.microsoft.com/office/word/2026/wordml/cei" xmlns:a="http://schemas.openxmlformats.org/drawingml/2006/main" xmlns:adec="http://schemas.microsoft.com/office/drawing/2017/decorative" xmlns:pic="http://schemas.openxmlformats.org/drawingml/2006/picture" xmlns:a14="http://schemas.microsoft.com/office/drawing/2010/main">
             <w:pict>
               <v:roundrect id="AutoShape 14" style="position:absolute;margin-left:-25.6pt;margin-top:-17.6pt;width:554.7pt;height:303pt;z-index:251671552;visibility:visible;mso-wrap-style:square;mso-wrap-distance-left:9pt;mso-wrap-distance-top:0;mso-wrap-distance-right:9pt;mso-wrap-distance-bottom:0;mso-position-horizontal:absolute;mso-position-horizontal-relative:text;mso-position-vertical:absolute;mso-position-vertical-relative:text;v-text-anchor:top" alt="&quot;&quot;" o:spid="_x0000_s1026" stroked="f" arcsize="2907f" w14:anchorId="3DBDE4CA" o:gfxdata="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">
                 <v:fill type="frame" o:title="" recolor="t" rotate="t" r:id="rId13"/>
@@ -346,7 +346,7 @@
               </wp:anchor>
             </w:drawing>
           </mc:Choice>
-          <mc:Fallback xmlns:adec="http://schemas.microsoft.com/office/drawing/2017/decorative" xmlns:a14="http://schemas.microsoft.com/office/drawing/2010/main" xmlns:pic="http://schemas.openxmlformats.org/drawingml/2006/picture" xmlns:a="http://schemas.openxmlformats.org/drawingml/2006/main" xmlns:w16cei="http://schemas.microsoft.com/office/word/2026/wordml/cei">
+          <mc:Fallback xmlns:w16cei="http://schemas.microsoft.com/office/word/2026/wordml/cei" xmlns:a="http://schemas.openxmlformats.org/drawingml/2006/main" xmlns:pic="http://schemas.openxmlformats.org/drawingml/2006/picture" xmlns:a14="http://schemas.microsoft.com/office/drawing/2010/main" xmlns:adec="http://schemas.microsoft.com/office/drawing/2017/decorative">
             <w:pict>
               <v:roundrect id="Rectángulo: esquinas redondeadas 6" style="position:absolute;margin-left:-24.85pt;margin-top:35.55pt;width:8.55pt;height:56.7pt;z-index:251673600;visibility:visible;mso-wrap-style:square;mso-width-percent:0;mso-height-percent:0;mso-wrap-distance-left:9pt;mso-wrap-distance-top:0;mso-wrap-distance-right:9pt;mso-wrap-distance-bottom:0;mso-position-horizontal:absolute;mso-position-horizontal-relative:text;mso-position-vertical:absolute;mso-position-vertical-relative:text;mso-width-percent:0;mso-height-percent:0;mso-width-relative:margin;mso-height-relative:margin;v-text-anchor:middle" alt="&quot;&quot;" o:spid="_x0000_s1026" fillcolor="#ffb800" stroked="f" strokeweight="1pt" arcsize="0" w14:anchorId="19FE2BFE" o:gfxdata="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">
                 <v:stroke joinstyle="miter"/>
@@ -663,15 +663,7 @@
         <w:t>continuación,</w:t>
       </w:r>
       <w:r>
-        <w:t xml:space="preserve"> se documenta con evidencia visual, cada una de las funcionalidades de interactividad agregadas al sitio GameZone: manipulación del DOM, eventos </w:t>
-      </w:r>
-      <w:proofErr w:type="gramStart"/>
-      <w:r>
-        <w:t>click</w:t>
-      </w:r>
-      <w:proofErr w:type="gramEnd"/>
-      <w:r>
-        <w:t>/mouseover/submit, uso de la Fetch API con manejo de promesas y de errores, y verificación responsiva en tres tamaños de pantalla.</w:t>
+        <w:t xml:space="preserve"> se documenta con evidencia visual, cada una de las funcionalidades de interactividad agregadas al sitio GameZone: manipulación del DOM, eventos click/mouseover/submit, uso de la Fetch API con manejo de promesas y de errores, y verificación responsiva en tres tamaños de pantalla.</w:t>
       </w:r>
     </w:p>
     <w:p>
@@ -777,15 +769,7 @@
         <w:t xml:space="preserve">2. </w:t>
       </w:r>
       <w:r>
-        <w:t xml:space="preserve">Manipulación del DOM al pasar el </w:t>
-      </w:r>
-      <w:proofErr w:type="gramStart"/>
-      <w:r>
-        <w:t>mouse</w:t>
-      </w:r>
-      <w:proofErr w:type="gramEnd"/>
-      <w:r>
-        <w:t xml:space="preserve"> (evento mouseover)</w:t>
+        <w:t>Manipulación del DOM al pasar el mouse (evento mouseover)</w:t>
       </w:r>
     </w:p>
     <w:p>
@@ -848,29 +832,7 @@
           <w:sz w:val="20"/>
           <w:szCs w:val="20"/>
         </w:rPr>
-        <w:t xml:space="preserve">Figura 2. Al pasar el </w:t>
-      </w:r>
-      <w:proofErr w:type="gramStart"/>
-      <w:r>
-        <w:rPr>
-          <w:i/>
-          <w:iCs/>
-          <w:color w:val="444444"/>
-          <w:sz w:val="20"/>
-          <w:szCs w:val="20"/>
-        </w:rPr>
-        <w:t>mouse</w:t>
-      </w:r>
-      <w:proofErr w:type="gramEnd"/>
-      <w:r>
-        <w:rPr>
-          <w:i/>
-          <w:iCs/>
-          <w:color w:val="444444"/>
-          <w:sz w:val="20"/>
-          <w:szCs w:val="20"/>
-        </w:rPr>
-        <w:t xml:space="preserve"> sobre "Reinos Olvidados" se crea dinámicamente (createElement/appendChild) una ficha técnica con género y número de jugadores, tomada de atributos de la tarjeta.</w:t>
+        <w:t>Figura 2. Al pasar el mouse sobre "Reinos Olvidados" se crea dinámicamente (createElement/appendChild) una ficha técnica con género y número de jugadores, tomada de atributos de la tarjeta.</w:t>
       </w:r>
     </w:p>
     <w:p/>
@@ -885,15 +847,7 @@
         <w:t xml:space="preserve">3. </w:t>
       </w:r>
       <w:r>
-        <w:t xml:space="preserve">Evento </w:t>
-      </w:r>
-      <w:proofErr w:type="gramStart"/>
-      <w:r>
-        <w:t>click</w:t>
-      </w:r>
-      <w:proofErr w:type="gramEnd"/>
-      <w:r>
-        <w:t>: agregar a favoritos + notificación dinámica</w:t>
+        <w:t>Evento click: agregar a favoritos + notificación dinámica</w:t>
       </w:r>
     </w:p>
     <w:p>
@@ -1136,29 +1090,7 @@
           <w:sz w:val="20"/>
           <w:szCs w:val="20"/>
         </w:rPr>
-        <w:t xml:space="preserve">Figura 5. Sección "Accesorios recomendados": los datos se obtienen en tiempo real desde Fake Store API mediante </w:t>
-      </w:r>
-      <w:proofErr w:type="gramStart"/>
-      <w:r>
-        <w:rPr>
-          <w:i/>
-          <w:iCs/>
-          <w:color w:val="444444"/>
-          <w:sz w:val="20"/>
-          <w:szCs w:val="20"/>
-        </w:rPr>
-        <w:t>fetch(</w:t>
-      </w:r>
-      <w:proofErr w:type="gramEnd"/>
-      <w:r>
-        <w:rPr>
-          <w:i/>
-          <w:iCs/>
-          <w:color w:val="444444"/>
-          <w:sz w:val="20"/>
-          <w:szCs w:val="20"/>
-        </w:rPr>
-        <w:t>), y cada tarjeta se construye dinámicamente en JavaScript a partir del JSON recibido.</w:t>
+        <w:t>Figura 5. Sección "Accesorios recomendados": los datos se obtienen en tiempo real desde Fake Store API mediante fetch(), y cada tarjeta se construye dinámicamente en JavaScript a partir del JSON recibido.</w:t>
       </w:r>
     </w:p>
     <w:p>
@@ -1246,29 +1178,7 @@
           <w:sz w:val="20"/>
           <w:szCs w:val="20"/>
         </w:rPr>
-        <w:t xml:space="preserve">Figura 6. Si la solicitud falla (por ejemplo, sin conexión), la promesa se rechaza, el </w:t>
-      </w:r>
-      <w:proofErr w:type="gramStart"/>
-      <w:r>
-        <w:rPr>
-          <w:i/>
-          <w:iCs/>
-          <w:color w:val="444444"/>
-          <w:sz w:val="20"/>
-          <w:szCs w:val="20"/>
-        </w:rPr>
-        <w:t>bloque .catch</w:t>
-      </w:r>
-      <w:proofErr w:type="gramEnd"/>
-      <w:r>
-        <w:rPr>
-          <w:i/>
-          <w:iCs/>
-          <w:color w:val="444444"/>
-          <w:sz w:val="20"/>
-          <w:szCs w:val="20"/>
-        </w:rPr>
-        <w:t>() captura el error y el DOM muestra una alerta con un botón "Reintentar" en vez de dejar la sección vacía o rota.</w:t>
+        <w:t>Figura 6. Si la solicitud falla (por ejemplo, sin conexión), la promesa se rechaza, el bloque .catch() captura el error y el DOM muestra una alerta con un botón "Reintentar" en vez de dejar la sección vacía o rota.</w:t>
       </w:r>
     </w:p>
     <w:p>
@@ -1353,29 +1263,7 @@
           <w:sz w:val="20"/>
           <w:szCs w:val="20"/>
         </w:rPr>
-        <w:t xml:space="preserve">Figura 7. Al presionar "Reintentar", se vuelve a ejecutar </w:t>
-      </w:r>
-      <w:proofErr w:type="gramStart"/>
-      <w:r>
-        <w:rPr>
-          <w:i/>
-          <w:iCs/>
-          <w:color w:val="444444"/>
-          <w:sz w:val="20"/>
-          <w:szCs w:val="20"/>
-        </w:rPr>
-        <w:t>fetch(</w:t>
-      </w:r>
-      <w:proofErr w:type="gramEnd"/>
-      <w:r>
-        <w:rPr>
-          <w:i/>
-          <w:iCs/>
-          <w:color w:val="444444"/>
-          <w:sz w:val="20"/>
-          <w:szCs w:val="20"/>
-        </w:rPr>
-        <w:t>) y, esta vez, la promesa se resuelve correctamente y el catálogo externo se muestra con normalidad.</w:t>
+        <w:t>Figura 7. Al presionar "Reintentar", se vuelve a ejecutar fetch() y, esta vez, la promesa se resuelve correctamente y el catálogo externo se muestra con normalidad.</w:t>
       </w:r>
     </w:p>
     <w:p>
@@ -1460,29 +1348,7 @@
           <w:sz w:val="20"/>
           <w:szCs w:val="20"/>
         </w:rPr>
-        <w:t xml:space="preserve">Figura 8. Al enviar el formulario de contacto vacío, el evento submit se intercepta con </w:t>
-      </w:r>
-      <w:proofErr w:type="gramStart"/>
-      <w:r>
-        <w:rPr>
-          <w:i/>
-          <w:iCs/>
-          <w:color w:val="444444"/>
-          <w:sz w:val="20"/>
-          <w:szCs w:val="20"/>
-        </w:rPr>
-        <w:t>preventDefault(</w:t>
-      </w:r>
-      <w:proofErr w:type="gramEnd"/>
-      <w:r>
-        <w:rPr>
-          <w:i/>
-          <w:iCs/>
-          <w:color w:val="444444"/>
-          <w:sz w:val="20"/>
-          <w:szCs w:val="20"/>
-        </w:rPr>
-        <w:t>), se valida el contenido y se muestra un mensaje de error sin recargar la página.</w:t>
+        <w:t>Figura 8. Al enviar el formulario de contacto vacío, el evento submit se intercepta con preventDefault(), se valida el contenido y se muestra un mensaje de error sin recargar la página.</w:t>
       </w:r>
     </w:p>
     <w:p>
@@ -1567,29 +1433,7 @@
           <w:sz w:val="20"/>
           <w:szCs w:val="20"/>
         </w:rPr>
-        <w:t>Figura 9. Al completar correctamente nombre, correo y mensaje, se muestra una confirmación personalizada y el formulario se limpia automáticamente (</w:t>
-      </w:r>
-      <w:proofErr w:type="gramStart"/>
-      <w:r>
-        <w:rPr>
-          <w:i/>
-          <w:iCs/>
-          <w:color w:val="444444"/>
-          <w:sz w:val="20"/>
-          <w:szCs w:val="20"/>
-        </w:rPr>
-        <w:t>form.reset</w:t>
-      </w:r>
-      <w:proofErr w:type="gramEnd"/>
-      <w:r>
-        <w:rPr>
-          <w:i/>
-          <w:iCs/>
-          <w:color w:val="444444"/>
-          <w:sz w:val="20"/>
-          <w:szCs w:val="20"/>
-        </w:rPr>
-        <w:t>()).</w:t>
+        <w:t>Figura 9. Al completar correctamente nombre, correo y mensaje, se muestra una confirmación personalizada y el formulario se limpia automáticamente (form.reset()).</w:t>
       </w:r>
     </w:p>
     <w:p>
@@ -1822,6 +1666,385 @@
       </w:r>
     </w:p>
     <w:p/>
+    <w:p>
+      <w:pPr>
+        <w:pStyle w:val="Ttulo2"/>
+        <w:spacing w:before="200" w:after="150"/>
+      </w:pPr>
+      <w:r>
+        <w:rPr>
+          <w:b w:val="0"/>
+          <w:bCs/>
+        </w:rPr>
+        <w:br w:type="page"/>
+      </w:r>
+      <w:r>
+        <w:lastRenderedPageBreak/>
+        <w:t>1</w:t>
+      </w:r>
+      <w:r>
+        <w:t>3</w:t>
+      </w:r>
+      <w:r>
+        <w:t xml:space="preserve">. </w:t>
+      </w:r>
+      <w:r>
+        <w:t>Vista en distintos navegadores</w:t>
+      </w:r>
+    </w:p>
+    <w:p>
+      <w:pPr>
+        <w:ind w:left="459"/>
+        <w:rPr>
+          <w:b/>
+          <w:bCs/>
+        </w:rPr>
+      </w:pPr>
+      <w:r>
+        <w:rPr>
+          <w:noProof/>
+        </w:rPr>
+        <w:drawing>
+          <wp:inline distT="0" distB="0" distL="0" distR="0" wp14:anchorId="0DB2089F" wp14:editId="470A7469">
+            <wp:extent cx="6299835" cy="4864735"/>
+            <wp:effectExtent l="0" t="0" r="5715" b="0"/>
+            <wp:docPr id="1911656526" name="Imagen 1"/>
+            <wp:cNvGraphicFramePr>
+              <a:graphicFrameLocks xmlns:a="http://schemas.openxmlformats.org/drawingml/2006/main" noChangeAspect="1"/>
+            </wp:cNvGraphicFramePr>
+            <a:graphic xmlns:a="http://schemas.openxmlformats.org/drawingml/2006/main">
+              <a:graphicData uri="http://schemas.openxmlformats.org/drawingml/2006/picture">
+                <pic:pic xmlns:pic="http://schemas.openxmlformats.org/drawingml/2006/picture">
+                  <pic:nvPicPr>
+                    <pic:cNvPr id="1911656526" name=""/>
+                    <pic:cNvPicPr/>
+                  </pic:nvPicPr>
+                  <pic:blipFill>
+                    <a:blip r:embed="rId28"/>
+                    <a:stretch>
+                      <a:fillRect/>
+                    </a:stretch>
+                  </pic:blipFill>
+                  <pic:spPr>
+                    <a:xfrm>
+                      <a:off x="0" y="0"/>
+                      <a:ext cx="6299835" cy="4864735"/>
+                    </a:xfrm>
+                    <a:prstGeom prst="rect">
+                      <a:avLst/>
+                    </a:prstGeom>
+                  </pic:spPr>
+                </pic:pic>
+              </a:graphicData>
+            </a:graphic>
+          </wp:inline>
+        </w:drawing>
+      </w:r>
+    </w:p>
+    <w:p>
+      <w:pPr>
+        <w:spacing w:after="300"/>
+        <w:jc w:val="center"/>
+        <w:rPr>
+          <w:i/>
+          <w:iCs/>
+          <w:color w:val="444444"/>
+          <w:sz w:val="20"/>
+          <w:szCs w:val="20"/>
+        </w:rPr>
+      </w:pPr>
+      <w:r>
+        <w:rPr>
+          <w:i/>
+          <w:iCs/>
+          <w:color w:val="444444"/>
+          <w:sz w:val="20"/>
+          <w:szCs w:val="20"/>
+        </w:rPr>
+        <w:t>Figura 1</w:t>
+      </w:r>
+      <w:r>
+        <w:rPr>
+          <w:i/>
+          <w:iCs/>
+          <w:color w:val="444444"/>
+          <w:sz w:val="20"/>
+          <w:szCs w:val="20"/>
+        </w:rPr>
+        <w:t>3</w:t>
+      </w:r>
+      <w:r>
+        <w:rPr>
+          <w:i/>
+          <w:iCs/>
+          <w:color w:val="444444"/>
+          <w:sz w:val="20"/>
+          <w:szCs w:val="20"/>
+        </w:rPr>
+        <w:t xml:space="preserve">. </w:t>
+      </w:r>
+      <w:r>
+        <w:rPr>
+          <w:i/>
+          <w:iCs/>
+          <w:color w:val="444444"/>
+          <w:sz w:val="20"/>
+          <w:szCs w:val="20"/>
+        </w:rPr>
+        <w:t>Visualización en Chrome.</w:t>
+      </w:r>
+    </w:p>
+    <w:p>
+      <w:pPr>
+        <w:spacing w:after="300"/>
+        <w:rPr>
+          <w:b/>
+          <w:bCs/>
+        </w:rPr>
+      </w:pPr>
+      <w:r>
+        <w:rPr>
+          <w:noProof/>
+        </w:rPr>
+        <w:lastRenderedPageBreak/>
+        <w:drawing>
+          <wp:inline distT="0" distB="0" distL="0" distR="0" wp14:anchorId="6E3FB3ED" wp14:editId="49487D37">
+            <wp:extent cx="6299835" cy="4729480"/>
+            <wp:effectExtent l="0" t="0" r="5715" b="0"/>
+            <wp:docPr id="262988214" name="Imagen 1"/>
+            <wp:cNvGraphicFramePr>
+              <a:graphicFrameLocks xmlns:a="http://schemas.openxmlformats.org/drawingml/2006/main" noChangeAspect="1"/>
+            </wp:cNvGraphicFramePr>
+            <a:graphic xmlns:a="http://schemas.openxmlformats.org/drawingml/2006/main">
+              <a:graphicData uri="http://schemas.openxmlformats.org/drawingml/2006/picture">
+                <pic:pic xmlns:pic="http://schemas.openxmlformats.org/drawingml/2006/picture">
+                  <pic:nvPicPr>
+                    <pic:cNvPr id="262988214" name=""/>
+                    <pic:cNvPicPr/>
+                  </pic:nvPicPr>
+                  <pic:blipFill>
+                    <a:blip r:embed="rId29"/>
+                    <a:stretch>
+                      <a:fillRect/>
+                    </a:stretch>
+                  </pic:blipFill>
+                  <pic:spPr>
+                    <a:xfrm>
+                      <a:off x="0" y="0"/>
+                      <a:ext cx="6299835" cy="4729480"/>
+                    </a:xfrm>
+                    <a:prstGeom prst="rect">
+                      <a:avLst/>
+                    </a:prstGeom>
+                  </pic:spPr>
+                </pic:pic>
+              </a:graphicData>
+            </a:graphic>
+          </wp:inline>
+        </w:drawing>
+      </w:r>
+    </w:p>
+    <w:p>
+      <w:pPr>
+        <w:spacing w:after="300"/>
+        <w:jc w:val="center"/>
+        <w:rPr>
+          <w:i/>
+          <w:iCs/>
+          <w:color w:val="444444"/>
+          <w:sz w:val="20"/>
+          <w:szCs w:val="20"/>
+        </w:rPr>
+      </w:pPr>
+      <w:r>
+        <w:rPr>
+          <w:i/>
+          <w:iCs/>
+          <w:color w:val="444444"/>
+          <w:sz w:val="20"/>
+          <w:szCs w:val="20"/>
+        </w:rPr>
+        <w:t>Figura 1</w:t>
+      </w:r>
+      <w:r>
+        <w:rPr>
+          <w:i/>
+          <w:iCs/>
+          <w:color w:val="444444"/>
+          <w:sz w:val="20"/>
+          <w:szCs w:val="20"/>
+        </w:rPr>
+        <w:t>4</w:t>
+      </w:r>
+      <w:r>
+        <w:rPr>
+          <w:i/>
+          <w:iCs/>
+          <w:color w:val="444444"/>
+          <w:sz w:val="20"/>
+          <w:szCs w:val="20"/>
+        </w:rPr>
+        <w:t xml:space="preserve">. Visualización en </w:t>
+      </w:r>
+      <w:r>
+        <w:rPr>
+          <w:i/>
+          <w:iCs/>
+          <w:color w:val="444444"/>
+          <w:sz w:val="20"/>
+          <w:szCs w:val="20"/>
+        </w:rPr>
+        <w:t>Firefox</w:t>
+      </w:r>
+      <w:r>
+        <w:rPr>
+          <w:i/>
+          <w:iCs/>
+          <w:color w:val="444444"/>
+          <w:sz w:val="20"/>
+          <w:szCs w:val="20"/>
+        </w:rPr>
+        <w:t>.</w:t>
+      </w:r>
+    </w:p>
+    <w:p>
+      <w:pPr>
+        <w:ind w:left="459"/>
+        <w:rPr>
+          <w:b/>
+          <w:bCs/>
+        </w:rPr>
+      </w:pPr>
+    </w:p>
+    <w:p>
+      <w:pPr>
+        <w:ind w:left="459"/>
+        <w:rPr>
+          <w:b/>
+          <w:bCs/>
+        </w:rPr>
+      </w:pPr>
+      <w:r>
+        <w:rPr>
+          <w:b/>
+          <w:bCs/>
+        </w:rPr>
+        <w:br w:type="page"/>
+      </w:r>
+      <w:r>
+        <w:rPr>
+          <w:noProof/>
+        </w:rPr>
+        <w:lastRenderedPageBreak/>
+        <w:drawing>
+          <wp:inline distT="0" distB="0" distL="0" distR="0" wp14:anchorId="27C65393" wp14:editId="3899160A">
+            <wp:extent cx="6299835" cy="4755515"/>
+            <wp:effectExtent l="0" t="0" r="5715" b="6985"/>
+            <wp:docPr id="427978113" name="Imagen 1"/>
+            <wp:cNvGraphicFramePr>
+              <a:graphicFrameLocks xmlns:a="http://schemas.openxmlformats.org/drawingml/2006/main" noChangeAspect="1"/>
+            </wp:cNvGraphicFramePr>
+            <a:graphic xmlns:a="http://schemas.openxmlformats.org/drawingml/2006/main">
+              <a:graphicData uri="http://schemas.openxmlformats.org/drawingml/2006/picture">
+                <pic:pic xmlns:pic="http://schemas.openxmlformats.org/drawingml/2006/picture">
+                  <pic:nvPicPr>
+                    <pic:cNvPr id="427978113" name=""/>
+                    <pic:cNvPicPr/>
+                  </pic:nvPicPr>
+                  <pic:blipFill>
+                    <a:blip r:embed="rId30"/>
+                    <a:stretch>
+                      <a:fillRect/>
+                    </a:stretch>
+                  </pic:blipFill>
+                  <pic:spPr>
+                    <a:xfrm>
+                      <a:off x="0" y="0"/>
+                      <a:ext cx="6299835" cy="4755515"/>
+                    </a:xfrm>
+                    <a:prstGeom prst="rect">
+                      <a:avLst/>
+                    </a:prstGeom>
+                  </pic:spPr>
+                </pic:pic>
+              </a:graphicData>
+            </a:graphic>
+          </wp:inline>
+        </w:drawing>
+      </w:r>
+    </w:p>
+    <w:p>
+      <w:pPr>
+        <w:spacing w:after="300"/>
+        <w:jc w:val="center"/>
+        <w:rPr>
+          <w:i/>
+          <w:iCs/>
+          <w:color w:val="444444"/>
+          <w:sz w:val="20"/>
+          <w:szCs w:val="20"/>
+        </w:rPr>
+      </w:pPr>
+      <w:r>
+        <w:rPr>
+          <w:i/>
+          <w:iCs/>
+          <w:color w:val="444444"/>
+          <w:sz w:val="20"/>
+          <w:szCs w:val="20"/>
+        </w:rPr>
+        <w:t>Figura 1</w:t>
+      </w:r>
+      <w:r>
+        <w:rPr>
+          <w:i/>
+          <w:iCs/>
+          <w:color w:val="444444"/>
+          <w:sz w:val="20"/>
+          <w:szCs w:val="20"/>
+        </w:rPr>
+        <w:t>5</w:t>
+      </w:r>
+      <w:r>
+        <w:rPr>
+          <w:i/>
+          <w:iCs/>
+          <w:color w:val="444444"/>
+          <w:sz w:val="20"/>
+          <w:szCs w:val="20"/>
+        </w:rPr>
+        <w:t xml:space="preserve">. Visualización en </w:t>
+      </w:r>
+      <w:r>
+        <w:rPr>
+          <w:i/>
+          <w:iCs/>
+          <w:color w:val="444444"/>
+          <w:sz w:val="20"/>
+          <w:szCs w:val="20"/>
+        </w:rPr>
+        <w:t>Chrome</w:t>
+      </w:r>
+      <w:r>
+        <w:rPr>
+          <w:i/>
+          <w:iCs/>
+          <w:color w:val="444444"/>
+          <w:sz w:val="20"/>
+          <w:szCs w:val="20"/>
+        </w:rPr>
+        <w:t>.</w:t>
+      </w:r>
+    </w:p>
+    <w:p>
+      <w:pPr>
+        <w:ind w:left="459"/>
+        <w:rPr>
+          <w:b/>
+          <w:bCs/>
+        </w:rPr>
+      </w:pPr>
+    </w:p>
     <w:p>
       <w:pPr>
         <w:pageBreakBefore/>
@@ -2044,7 +2267,7 @@
               </wp:anchor>
             </w:drawing>
           </mc:Choice>
-          <mc:Fallback xmlns:adec="http://schemas.microsoft.com/office/drawing/2017/decorative" xmlns:a14="http://schemas.microsoft.com/office/drawing/2010/main" xmlns:pic="http://schemas.openxmlformats.org/drawingml/2006/picture" xmlns:a="http://schemas.openxmlformats.org/drawingml/2006/main" xmlns:w16cei="http://schemas.microsoft.com/office/word/2026/wordml/cei">
+          <mc:Fallback xmlns:w16cei="http://schemas.microsoft.com/office/word/2026/wordml/cei" xmlns:a="http://schemas.openxmlformats.org/drawingml/2006/main" xmlns:pic="http://schemas.openxmlformats.org/drawingml/2006/picture" xmlns:a14="http://schemas.microsoft.com/office/drawing/2010/main" xmlns:adec="http://schemas.microsoft.com/office/drawing/2017/decorative">
             <w:pict>
               <v:roundrect id="Rectángulo: esquinas redondeadas 1" style="position:absolute;margin-left:-29.55pt;margin-top:31.55pt;width:552.75pt;height:354.35pt;z-index:251676672;visibility:visible;mso-wrap-style:square;mso-wrap-distance-left:9pt;mso-wrap-distance-top:0;mso-wrap-distance-right:9pt;mso-wrap-distance-bottom:0;mso-position-horizontal:absolute;mso-position-horizontal-relative:text;mso-position-vertical:absolute;mso-position-vertical-relative:text;v-text-anchor:middle" alt="&quot;&quot;" o:spid="_x0000_s1026" fillcolor="#e6e7e8" stroked="f" strokeweight="1pt" arcsize="2030f" w14:anchorId="3F5385BB" o:gfxdata="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">
                 <v:stroke joinstyle="miter"/>
@@ -2064,7 +2287,7 @@
           <w:noProof/>
         </w:rPr>
         <w:drawing>
-          <wp:anchor distT="0" distB="0" distL="114300" distR="114300" simplePos="0" relativeHeight="251677696" behindDoc="0" locked="0" layoutInCell="1" allowOverlap="1" wp14:anchorId="2A005252" wp14:editId="4258110B">
+          <wp:anchor distT="0" distB="0" distL="114300" distR="114300" simplePos="0" relativeHeight="251677696" behindDoc="0" locked="0" layoutInCell="1" allowOverlap="1" wp14:anchorId="2A005252" wp14:editId="4C6E47E8">
             <wp:simplePos x="0" y="0"/>
             <wp:positionH relativeFrom="column">
               <wp:posOffset>1642954</wp:posOffset>
@@ -2089,7 +2312,7 @@
                     </pic:cNvPicPr>
                   </pic:nvPicPr>
                   <pic:blipFill>
-                    <a:blip r:embed="rId28" cstate="print">
+                    <a:blip r:embed="rId31" cstate="print">
                       <a:extLst>
                         <a:ext uri="{28A0092B-C50C-407E-A947-70E740481C1C}">
                           <a14:useLocalDpi xmlns:a14="http://schemas.microsoft.com/office/drawing/2010/main" val="0"/>
@@ -2141,7 +2364,7 @@
     </w:p>
     <w:p/>
     <w:sectPr>
-      <w:footerReference w:type="first" r:id="rId29"/>
+      <w:footerReference w:type="first" r:id="rId32"/>
       <w:pgSz w:w="12240" w:h="15840"/>
       <w:pgMar w:top="1559" w:right="1185" w:bottom="284" w:left="1134" w:header="709" w:footer="283" w:gutter="0"/>
       <w:cols w:space="708"/>
@@ -2351,7 +2574,7 @@
                 </wp:anchor>
               </w:drawing>
             </mc:Choice>
-            <mc:Fallback xmlns:a14="http://schemas.microsoft.com/office/drawing/2010/main" xmlns:pic="http://schemas.openxmlformats.org/drawingml/2006/picture" xmlns:adec="http://schemas.microsoft.com/office/drawing/2017/decorative" xmlns:a="http://schemas.openxmlformats.org/drawingml/2006/main" xmlns:w16cei="http://schemas.microsoft.com/office/word/2026/wordml/cei">
+            <mc:Fallback xmlns:w16cei="http://schemas.microsoft.com/office/word/2026/wordml/cei" xmlns:a="http://schemas.openxmlformats.org/drawingml/2006/main" xmlns:adec="http://schemas.microsoft.com/office/drawing/2017/decorative" xmlns:pic="http://schemas.openxmlformats.org/drawingml/2006/picture" xmlns:a14="http://schemas.microsoft.com/office/drawing/2010/main">
               <w:pict>
                 <v:group id="Grupo 1" style="position:absolute;margin-left:409.95pt;margin-top:-3.8pt;width:94.15pt;height:22.7pt;z-index:251694080" alt="&quot;&quot;" coordsize="11957,2882" o:spid="_x0000_s1026" w14:anchorId="6CCFE1D3" o:gfxdata="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">
                   <v:shapetype id="_x0000_t75" coordsize="21600,21600" filled="f" stroked="f" o:spt="75" o:preferrelative="t" path="m@4@5l@4@11@9@11@9@5xe">
@@ -5370,12 +5593,24 @@
 </file>
 
 <file path=customXml/item2.xml><?xml version="1.0" encoding="utf-8"?>
-<?mso-contentType ?>
-<FormTemplates xmlns="http://schemas.microsoft.com/sharepoint/v3/contenttype/forms">
-  <Display>DocumentLibraryForm</Display>
-  <Edit>DocumentLibraryForm</Edit>
-  <New>DocumentLibraryForm</New>
-</FormTemplates>
+<p:properties xmlns:p="http://schemas.microsoft.com/office/2006/metadata/properties" xmlns:xsi="http://www.w3.org/2001/XMLSchema-instance" xmlns:pc="http://schemas.microsoft.com/office/infopath/2007/PartnerControls">
+  <documentManagement>
+    <lcf76f155ced4ddcb4097134ff3c332f xmlns="d0daa353-f819-43d1-badf-ce69fea8800d">
+      <Terms xmlns="http://schemas.microsoft.com/office/infopath/2007/PartnerControls"/>
+    </lcf76f155ced4ddcb4097134ff3c332f>
+    <TaxCatchAll xmlns="edc1eb1c-f9b5-429a-a0ce-702847a0aa2d" xsi:nil="true"/>
+    <Fecha_x0020_de_x0020_creaci_x00f3_n xmlns="d0daa353-f819-43d1-badf-ce69fea8800d" xsi:nil="true"/>
+    <Fechayhora xmlns="d0daa353-f819-43d1-badf-ce69fea8800d" xsi:nil="true"/>
+    <SharedWithUsers xmlns="edc1eb1c-f9b5-429a-a0ce-702847a0aa2d">
+      <UserInfo>
+        <DisplayName/>
+        <AccountId xsi:nil="true"/>
+        <AccountType/>
+      </UserInfo>
+    </SharedWithUsers>
+    <MediaLengthInSeconds xmlns="d0daa353-f819-43d1-badf-ce69fea8800d" xsi:nil="true"/>
+  </documentManagement>
+</p:properties>
 </file>
 
 <file path=customXml/item3.xml><?xml version="1.0" encoding="utf-8"?>
@@ -5640,24 +5875,12 @@
 </file>
 
 <file path=customXml/item4.xml><?xml version="1.0" encoding="utf-8"?>
-<p:properties xmlns:p="http://schemas.microsoft.com/office/2006/metadata/properties" xmlns:xsi="http://www.w3.org/2001/XMLSchema-instance" xmlns:pc="http://schemas.microsoft.com/office/infopath/2007/PartnerControls">
-  <documentManagement>
-    <lcf76f155ced4ddcb4097134ff3c332f xmlns="d0daa353-f819-43d1-badf-ce69fea8800d">
-      <Terms xmlns="http://schemas.microsoft.com/office/infopath/2007/PartnerControls"/>
-    </lcf76f155ced4ddcb4097134ff3c332f>
-    <TaxCatchAll xmlns="edc1eb1c-f9b5-429a-a0ce-702847a0aa2d" xsi:nil="true"/>
-    <Fecha_x0020_de_x0020_creaci_x00f3_n xmlns="d0daa353-f819-43d1-badf-ce69fea8800d" xsi:nil="true"/>
-    <Fechayhora xmlns="d0daa353-f819-43d1-badf-ce69fea8800d" xsi:nil="true"/>
-    <SharedWithUsers xmlns="edc1eb1c-f9b5-429a-a0ce-702847a0aa2d">
-      <UserInfo>
-        <DisplayName/>
-        <AccountId xsi:nil="true"/>
-        <AccountType/>
-      </UserInfo>
-    </SharedWithUsers>
-    <MediaLengthInSeconds xmlns="d0daa353-f819-43d1-badf-ce69fea8800d" xsi:nil="true"/>
-  </documentManagement>
-</p:properties>
+<?mso-contentType ?>
+<FormTemplates xmlns="http://schemas.microsoft.com/sharepoint/v3/contenttype/forms">
+  <Display>DocumentLibraryForm</Display>
+  <Edit>DocumentLibraryForm</Edit>
+  <New>DocumentLibraryForm</New>
+</FormTemplates>
 </file>
 
 <file path=customXml/itemProps1.xml><?xml version="1.0" encoding="utf-8"?>
@@ -5669,9 +5892,12 @@
 </file>
 
 <file path=customXml/itemProps2.xml><?xml version="1.0" encoding="utf-8"?>
-<ds:datastoreItem xmlns:ds="http://schemas.openxmlformats.org/officeDocument/2006/customXml" ds:itemID="{58D8DE95-DF74-49C6-8885-90B115E8F94F}">
+<ds:datastoreItem xmlns:ds="http://schemas.openxmlformats.org/officeDocument/2006/customXml" ds:itemID="{C39D5494-1847-4215-BB00-A838605872D2}">
   <ds:schemaRefs>
-    <ds:schemaRef ds:uri="http://schemas.microsoft.com/sharepoint/v3/contenttype/forms"/>
+    <ds:schemaRef ds:uri="http://schemas.microsoft.com/office/2006/metadata/properties"/>
+    <ds:schemaRef ds:uri="http://schemas.microsoft.com/office/infopath/2007/PartnerControls"/>
+    <ds:schemaRef ds:uri="d0daa353-f819-43d1-badf-ce69fea8800d"/>
+    <ds:schemaRef ds:uri="edc1eb1c-f9b5-429a-a0ce-702847a0aa2d"/>
   </ds:schemaRefs>
 </ds:datastoreItem>
 </file>
@@ -5696,12 +5922,9 @@
 </file>
 
 <file path=customXml/itemProps4.xml><?xml version="1.0" encoding="utf-8"?>
-<ds:datastoreItem xmlns:ds="http://schemas.openxmlformats.org/officeDocument/2006/customXml" ds:itemID="{C39D5494-1847-4215-BB00-A838605872D2}">
+<ds:datastoreItem xmlns:ds="http://schemas.openxmlformats.org/officeDocument/2006/customXml" ds:itemID="{58D8DE95-DF74-49C6-8885-90B115E8F94F}">
   <ds:schemaRefs>
-    <ds:schemaRef ds:uri="http://schemas.microsoft.com/office/2006/metadata/properties"/>
-    <ds:schemaRef ds:uri="http://schemas.microsoft.com/office/infopath/2007/PartnerControls"/>
-    <ds:schemaRef ds:uri="d0daa353-f819-43d1-badf-ce69fea8800d"/>
-    <ds:schemaRef ds:uri="edc1eb1c-f9b5-429a-a0ce-702847a0aa2d"/>
+    <ds:schemaRef ds:uri="http://schemas.microsoft.com/sharepoint/v3/contenttype/forms"/>
   </ds:schemaRefs>
 </ds:datastoreItem>
 </file>
</xml_diff>

<commit_message>
Incorporación evidencias en diferentes navegadores en docs part2
</commit_message>
<xml_diff>
--- a/docs/Fernando_Fuentes_PFY2201_EXP2_S5_.docx
+++ b/docs/Fernando_Fuentes_PFY2201_EXP2_S5_.docx
@@ -1791,7 +1791,27 @@
           <w:sz w:val="20"/>
           <w:szCs w:val="20"/>
         </w:rPr>
-        <w:t>Visualización en Chrome.</w:t>
+        <w:t xml:space="preserve">Visualización en </w:t>
+      </w:r>
+      <w:r>
+        <w:rPr>
+          <w:i/>
+          <w:iCs/>
+          <w:color w:val="444444"/>
+          <w:sz w:val="20"/>
+          <w:szCs w:val="20"/>
+        </w:rPr>
+        <w:t>Edge</w:t>
+      </w:r>
+      <w:r>
+        <w:rPr>
+          <w:i/>
+          <w:iCs/>
+          <w:color w:val="444444"/>
+          <w:sz w:val="20"/>
+          <w:szCs w:val="20"/>
+        </w:rPr>
+        <w:t>.</w:t>
       </w:r>
     </w:p>
     <w:p>

</xml_diff>